<commit_message>
Fix Lab 15 numbering sequence and add APA SE in Problem 19
</commit_message>
<xml_diff>
--- a/Lab15/lab15_output/lab_15_final.docx
+++ b/Lab15/lab15_output/lab_15_final.docx
@@ -771,7 +771,7 @@
       </w:r>
     </w:p>
     <w:bookmarkEnd w:id="21"/>
-    <w:bookmarkStart w:id="22" w:name="problem-3-2-pts"/>
+    <w:bookmarkStart w:id="24" w:name="problem-3-2-pts"/>
     <w:p>
       <w:pPr>
         <w:pStyle w:val="Heading2"/>
@@ -827,126 +827,13 @@
         <w:t xml:space="preserve">).</w:t>
       </w:r>
     </w:p>
-    <w:p>
-      <w:pPr>
-        <w:pStyle w:val="BodyText"/>
-      </w:pPr>
-      <w:r>
-        <w:t xml:space="preserve">Syntax:</w:t>
-      </w:r>
-    </w:p>
-    <w:p>
-      <w:pPr>
-        <w:pStyle w:val="SourceCode"/>
-      </w:pPr>
-      <w:r>
-        <w:rPr>
-          <w:rStyle w:val="FunctionTok"/>
-        </w:rPr>
-        <w:t xml:space="preserve">summary</w:t>
-      </w:r>
-      <w:r>
-        <w:rPr>
-          <w:rStyle w:val="NormalTok"/>
-        </w:rPr>
-        <w:t xml:space="preserve">(ecls</w:t>
-      </w:r>
-      <w:r>
-        <w:rPr>
-          <w:rStyle w:val="SpecialCharTok"/>
-        </w:rPr>
-        <w:t xml:space="preserve">$</w:t>
-      </w:r>
-      <w:r>
-        <w:rPr>
-          <w:rStyle w:val="NormalTok"/>
-        </w:rPr>
-        <w:t xml:space="preserve">c2rtscor)</w:t>
-      </w:r>
-      <w:r>
-        <w:br/>
-      </w:r>
-      <w:r>
-        <w:rPr>
-          <w:rStyle w:val="FunctionTok"/>
-        </w:rPr>
-        <w:t xml:space="preserve">summary</w:t>
-      </w:r>
-      <w:r>
-        <w:rPr>
-          <w:rStyle w:val="NormalTok"/>
-        </w:rPr>
-        <w:t xml:space="preserve">(ecls</w:t>
-      </w:r>
-      <w:r>
-        <w:rPr>
-          <w:rStyle w:val="SpecialCharTok"/>
-        </w:rPr>
-        <w:t xml:space="preserve">$</w:t>
-      </w:r>
-      <w:r>
-        <w:rPr>
-          <w:rStyle w:val="NormalTok"/>
-        </w:rPr>
-        <w:t xml:space="preserve">wkincome)</w:t>
-      </w:r>
-    </w:p>
-    <w:p>
-      <w:pPr>
-        <w:pStyle w:val="FirstParagraph"/>
-      </w:pPr>
-      <w:r>
-        <w:t xml:space="preserve">Output:</w:t>
-      </w:r>
-    </w:p>
-    <w:p>
-      <w:pPr>
-        <w:pStyle w:val="SourceCode"/>
-      </w:pPr>
-      <w:r>
-        <w:rPr>
-          <w:rStyle w:val="VerbatimChar"/>
-        </w:rPr>
-        <w:t xml:space="preserve">##    Min. 1st Qu.  Median    Mean 3rd Qu.    Max.    NA's </w:t>
-      </w:r>
-      <w:r>
-        <w:br/>
-      </w:r>
-      <w:r>
-        <w:rPr>
-          <w:rStyle w:val="VerbatimChar"/>
-        </w:rPr>
-        <w:t xml:space="preserve">##    14.9    44.4    51.5    50.6    57.1    83.2    2323</w:t>
-      </w:r>
-    </w:p>
-    <w:p>
-      <w:pPr>
-        <w:pStyle w:val="SourceCode"/>
-      </w:pPr>
-      <w:r>
-        <w:rPr>
-          <w:rStyle w:val="VerbatimChar"/>
-        </w:rPr>
-        <w:t xml:space="preserve">##    Min. 1st Qu.  Median    Mean 3rd Qu.    Max.    NA's </w:t>
-      </w:r>
-      <w:r>
-        <w:br/>
-      </w:r>
-      <w:r>
-        <w:rPr>
-          <w:rStyle w:val="VerbatimChar"/>
-        </w:rPr>
-        <w:t xml:space="preserve">##       0   21000   40000   52040   68000 1000000    1119</w:t>
-      </w:r>
-    </w:p>
-    <w:bookmarkEnd w:id="22"/>
-    <w:bookmarkStart w:id="23" w:name="problem-2-1-pt"/>
-    <w:p>
-      <w:pPr>
-        <w:pStyle w:val="Heading2"/>
-      </w:pPr>
-      <w:r>
-        <w:t xml:space="preserve">Problem 2 (1 pt)</w:t>
+    <w:bookmarkStart w:id="22" w:name="Xfbd2c2beffdca39e23772eff9cbcaa80be8c20e"/>
+    <w:p>
+      <w:pPr>
+        <w:pStyle w:val="Heading3"/>
+      </w:pPr>
+      <w:r>
+        <w:t xml:space="preserve">Additional Task (1 pt): Create a z-standardized reading-score variable</w:t>
       </w:r>
     </w:p>
     <w:p>
@@ -980,148 +867,14 @@
         <w:t xml:space="preserve">For the rest of the assignment, when I ask you to use the test scores variable, use this one, not the original variable containing the raw metric.</w:t>
       </w:r>
     </w:p>
-    <w:p>
-      <w:pPr>
-        <w:pStyle w:val="BodyText"/>
-      </w:pPr>
-      <w:r>
-        <w:t xml:space="preserve">Syntax:</w:t>
-      </w:r>
-    </w:p>
-    <w:p>
-      <w:pPr>
-        <w:pStyle w:val="SourceCode"/>
-      </w:pPr>
-      <w:r>
-        <w:rPr>
-          <w:rStyle w:val="NormalTok"/>
-        </w:rPr>
-        <w:t xml:space="preserve">ecls</w:t>
-      </w:r>
-      <w:r>
-        <w:rPr>
-          <w:rStyle w:val="SpecialCharTok"/>
-        </w:rPr>
-        <w:t xml:space="preserve">$</w:t>
-      </w:r>
-      <w:r>
-        <w:rPr>
-          <w:rStyle w:val="NormalTok"/>
-        </w:rPr>
-        <w:t xml:space="preserve">read_z </w:t>
-      </w:r>
-      <w:r>
-        <w:rPr>
-          <w:rStyle w:val="OtherTok"/>
-        </w:rPr>
-        <w:t xml:space="preserve">&lt;-</w:t>
-      </w:r>
-      <w:r>
-        <w:rPr>
-          <w:rStyle w:val="NormalTok"/>
-        </w:rPr>
-        <w:t xml:space="preserve"> </w:t>
-      </w:r>
-      <w:r>
-        <w:rPr>
-          <w:rStyle w:val="FunctionTok"/>
-        </w:rPr>
-        <w:t xml:space="preserve">as.numeric</w:t>
-      </w:r>
-      <w:r>
-        <w:rPr>
-          <w:rStyle w:val="NormalTok"/>
-        </w:rPr>
-        <w:t xml:space="preserve">(</w:t>
-      </w:r>
-      <w:r>
-        <w:rPr>
-          <w:rStyle w:val="FunctionTok"/>
-        </w:rPr>
-        <w:t xml:space="preserve">scale</w:t>
-      </w:r>
-      <w:r>
-        <w:rPr>
-          <w:rStyle w:val="NormalTok"/>
-        </w:rPr>
-        <w:t xml:space="preserve">(ecls</w:t>
-      </w:r>
-      <w:r>
-        <w:rPr>
-          <w:rStyle w:val="SpecialCharTok"/>
-        </w:rPr>
-        <w:t xml:space="preserve">$</w:t>
-      </w:r>
-      <w:r>
-        <w:rPr>
-          <w:rStyle w:val="NormalTok"/>
-        </w:rPr>
-        <w:t xml:space="preserve">c2rtscor))</w:t>
-      </w:r>
-      <w:r>
-        <w:br/>
-      </w:r>
-      <w:r>
-        <w:rPr>
-          <w:rStyle w:val="FunctionTok"/>
-        </w:rPr>
-        <w:t xml:space="preserve">summary</w:t>
-      </w:r>
-      <w:r>
-        <w:rPr>
-          <w:rStyle w:val="NormalTok"/>
-        </w:rPr>
-        <w:t xml:space="preserve">(ecls</w:t>
-      </w:r>
-      <w:r>
-        <w:rPr>
-          <w:rStyle w:val="SpecialCharTok"/>
-        </w:rPr>
-        <w:t xml:space="preserve">$</w:t>
-      </w:r>
-      <w:r>
-        <w:rPr>
-          <w:rStyle w:val="NormalTok"/>
-        </w:rPr>
-        <w:t xml:space="preserve">read_z)</w:t>
-      </w:r>
-    </w:p>
-    <w:p>
-      <w:pPr>
-        <w:pStyle w:val="FirstParagraph"/>
-      </w:pPr>
-      <w:r>
-        <w:t xml:space="preserve">Output:</w:t>
-      </w:r>
-    </w:p>
-    <w:p>
-      <w:pPr>
-        <w:pStyle w:val="SourceCode"/>
-      </w:pPr>
-      <w:r>
-        <w:rPr>
-          <w:rStyle w:val="VerbatimChar"/>
-        </w:rPr>
-        <w:t xml:space="preserve">##    Min. 1st Qu.  Median    Mean 3rd Qu.    Max.    NA's </w:t>
-      </w:r>
-      <w:r>
-        <w:br/>
-      </w:r>
-      <w:r>
-        <w:rPr>
-          <w:rStyle w:val="VerbatimChar"/>
-        </w:rPr>
-        <w:t xml:space="preserve">##  -3.602  -0.628   0.085   0.000   0.656   3.284    2323</w:t>
-      </w:r>
-    </w:p>
-    <w:bookmarkEnd w:id="23"/>
-    <w:bookmarkStart w:id="24" w:name="problem-3-1-pt"/>
-    <w:p>
-      <w:pPr>
-        <w:pStyle w:val="Heading2"/>
-      </w:pPr>
-      <w:r>
-        <w:t xml:space="preserve">Problem 3 (1 pt)</w:t>
+    <w:bookmarkEnd w:id="22"/>
+    <w:bookmarkStart w:id="23" w:name="Xa0c4cab62f3f573a85562f5192bbe3ab5fcff2c"/>
+    <w:p>
+      <w:pPr>
+        <w:pStyle w:val="Heading3"/>
+      </w:pPr>
+      <w:r>
+        <w:t xml:space="preserve">Additional Task (1 pt): Rescale family income to $10,000 units</w:t>
       </w:r>
     </w:p>
     <w:p>
@@ -1156,6 +909,63 @@
       </w:pPr>
       <w:r>
         <w:rPr>
+          <w:rStyle w:val="FunctionTok"/>
+        </w:rPr>
+        <w:t xml:space="preserve">summary</w:t>
+      </w:r>
+      <w:r>
+        <w:rPr>
+          <w:rStyle w:val="NormalTok"/>
+        </w:rPr>
+        <w:t xml:space="preserve">(ecls</w:t>
+      </w:r>
+      <w:r>
+        <w:rPr>
+          <w:rStyle w:val="SpecialCharTok"/>
+        </w:rPr>
+        <w:t xml:space="preserve">$</w:t>
+      </w:r>
+      <w:r>
+        <w:rPr>
+          <w:rStyle w:val="NormalTok"/>
+        </w:rPr>
+        <w:t xml:space="preserve">c2rtscor)</w:t>
+      </w:r>
+      <w:r>
+        <w:br/>
+      </w:r>
+      <w:r>
+        <w:rPr>
+          <w:rStyle w:val="FunctionTok"/>
+        </w:rPr>
+        <w:t xml:space="preserve">summary</w:t>
+      </w:r>
+      <w:r>
+        <w:rPr>
+          <w:rStyle w:val="NormalTok"/>
+        </w:rPr>
+        <w:t xml:space="preserve">(ecls</w:t>
+      </w:r>
+      <w:r>
+        <w:rPr>
+          <w:rStyle w:val="SpecialCharTok"/>
+        </w:rPr>
+        <w:t xml:space="preserve">$</w:t>
+      </w:r>
+      <w:r>
+        <w:rPr>
+          <w:rStyle w:val="NormalTok"/>
+        </w:rPr>
+        <w:t xml:space="preserve">wkincome)</w:t>
+      </w:r>
+      <w:r>
+        <w:br/>
+      </w:r>
+      <w:r>
+        <w:br/>
+      </w:r>
+      <w:r>
+        <w:rPr>
           <w:rStyle w:val="NormalTok"/>
         </w:rPr>
         <w:t xml:space="preserve">ecls</w:t>
@@ -1170,6 +980,105 @@
         <w:rPr>
           <w:rStyle w:val="NormalTok"/>
         </w:rPr>
+        <w:t xml:space="preserve">read_z </w:t>
+      </w:r>
+      <w:r>
+        <w:rPr>
+          <w:rStyle w:val="OtherTok"/>
+        </w:rPr>
+        <w:t xml:space="preserve">&lt;-</w:t>
+      </w:r>
+      <w:r>
+        <w:rPr>
+          <w:rStyle w:val="NormalTok"/>
+        </w:rPr>
+        <w:t xml:space="preserve"> </w:t>
+      </w:r>
+      <w:r>
+        <w:rPr>
+          <w:rStyle w:val="FunctionTok"/>
+        </w:rPr>
+        <w:t xml:space="preserve">as.numeric</w:t>
+      </w:r>
+      <w:r>
+        <w:rPr>
+          <w:rStyle w:val="NormalTok"/>
+        </w:rPr>
+        <w:t xml:space="preserve">(</w:t>
+      </w:r>
+      <w:r>
+        <w:rPr>
+          <w:rStyle w:val="FunctionTok"/>
+        </w:rPr>
+        <w:t xml:space="preserve">scale</w:t>
+      </w:r>
+      <w:r>
+        <w:rPr>
+          <w:rStyle w:val="NormalTok"/>
+        </w:rPr>
+        <w:t xml:space="preserve">(ecls</w:t>
+      </w:r>
+      <w:r>
+        <w:rPr>
+          <w:rStyle w:val="SpecialCharTok"/>
+        </w:rPr>
+        <w:t xml:space="preserve">$</w:t>
+      </w:r>
+      <w:r>
+        <w:rPr>
+          <w:rStyle w:val="NormalTok"/>
+        </w:rPr>
+        <w:t xml:space="preserve">c2rtscor))</w:t>
+      </w:r>
+      <w:r>
+        <w:br/>
+      </w:r>
+      <w:r>
+        <w:rPr>
+          <w:rStyle w:val="FunctionTok"/>
+        </w:rPr>
+        <w:t xml:space="preserve">summary</w:t>
+      </w:r>
+      <w:r>
+        <w:rPr>
+          <w:rStyle w:val="NormalTok"/>
+        </w:rPr>
+        <w:t xml:space="preserve">(ecls</w:t>
+      </w:r>
+      <w:r>
+        <w:rPr>
+          <w:rStyle w:val="SpecialCharTok"/>
+        </w:rPr>
+        <w:t xml:space="preserve">$</w:t>
+      </w:r>
+      <w:r>
+        <w:rPr>
+          <w:rStyle w:val="NormalTok"/>
+        </w:rPr>
+        <w:t xml:space="preserve">read_z)</w:t>
+      </w:r>
+      <w:r>
+        <w:br/>
+      </w:r>
+      <w:r>
+        <w:br/>
+      </w:r>
+      <w:r>
+        <w:rPr>
+          <w:rStyle w:val="NormalTok"/>
+        </w:rPr>
+        <w:t xml:space="preserve">ecls</w:t>
+      </w:r>
+      <w:r>
+        <w:rPr>
+          <w:rStyle w:val="SpecialCharTok"/>
+        </w:rPr>
+        <w:t xml:space="preserve">$</w:t>
+      </w:r>
+      <w:r>
+        <w:rPr>
+          <w:rStyle w:val="NormalTok"/>
+        </w:rPr>
         <w:t xml:space="preserve">income10k </w:t>
       </w:r>
       <w:r>
@@ -1267,9 +1176,70 @@
         <w:rPr>
           <w:rStyle w:val="VerbatimChar"/>
         </w:rPr>
+        <w:t xml:space="preserve">##    14.9    44.4    51.5    50.6    57.1    83.2    2323</w:t>
+      </w:r>
+    </w:p>
+    <w:p>
+      <w:pPr>
+        <w:pStyle w:val="SourceCode"/>
+      </w:pPr>
+      <w:r>
+        <w:rPr>
+          <w:rStyle w:val="VerbatimChar"/>
+        </w:rPr>
+        <w:t xml:space="preserve">##    Min. 1st Qu.  Median    Mean 3rd Qu.    Max.    NA's </w:t>
+      </w:r>
+      <w:r>
+        <w:br/>
+      </w:r>
+      <w:r>
+        <w:rPr>
+          <w:rStyle w:val="VerbatimChar"/>
+        </w:rPr>
+        <w:t xml:space="preserve">##       0   21000   40000   52040   68000 1000000    1119</w:t>
+      </w:r>
+    </w:p>
+    <w:p>
+      <w:pPr>
+        <w:pStyle w:val="SourceCode"/>
+      </w:pPr>
+      <w:r>
+        <w:rPr>
+          <w:rStyle w:val="VerbatimChar"/>
+        </w:rPr>
+        <w:t xml:space="preserve">##    Min. 1st Qu.  Median    Mean 3rd Qu.    Max.    NA's </w:t>
+      </w:r>
+      <w:r>
+        <w:br/>
+      </w:r>
+      <w:r>
+        <w:rPr>
+          <w:rStyle w:val="VerbatimChar"/>
+        </w:rPr>
+        <w:t xml:space="preserve">##  -3.602  -0.628   0.085   0.000   0.656   3.284    2323</w:t>
+      </w:r>
+    </w:p>
+    <w:p>
+      <w:pPr>
+        <w:pStyle w:val="SourceCode"/>
+      </w:pPr>
+      <w:r>
+        <w:rPr>
+          <w:rStyle w:val="VerbatimChar"/>
+        </w:rPr>
+        <w:t xml:space="preserve">##    Min. 1st Qu.  Median    Mean 3rd Qu.    Max.    NA's </w:t>
+      </w:r>
+      <w:r>
+        <w:br/>
+      </w:r>
+      <w:r>
+        <w:rPr>
+          <w:rStyle w:val="VerbatimChar"/>
+        </w:rPr>
         <w:t xml:space="preserve">##     0.0     2.1     4.0     5.2     6.8   100.0    1119</w:t>
       </w:r>
     </w:p>
+    <w:bookmarkEnd w:id="23"/>
     <w:bookmarkEnd w:id="24"/>
     <w:bookmarkStart w:id="25" w:name="problem-4-1-pt"/>
     <w:p>
@@ -1333,7 +1303,7 @@
       </w:r>
     </w:p>
     <w:bookmarkEnd w:id="25"/>
-    <w:bookmarkStart w:id="26" w:name="problem-5-2-pts"/>
+    <w:bookmarkStart w:id="27" w:name="problem-5-2-pts"/>
     <w:p>
       <w:pPr>
         <w:pStyle w:val="Heading2"/>
@@ -1350,6 +1320,23 @@
         <w:t xml:space="preserve">Subset the data so that you only have cases with valid values on both the reading score and income variables. From now on just use this new subsetted data frame.</w:t>
       </w:r>
     </w:p>
+    <w:bookmarkStart w:id="26" w:name="Xdb8d5d20bd3c8ad11466cc79a28308fbdb70ed4"/>
+    <w:p>
+      <w:pPr>
+        <w:pStyle w:val="Heading3"/>
+      </w:pPr>
+      <w:r>
+        <w:t xml:space="preserve">Additional Task (1 pt): Count dropped cases after subsetting</w:t>
+      </w:r>
+    </w:p>
+    <w:p>
+      <w:pPr>
+        <w:pStyle w:val="FirstParagraph"/>
+      </w:pPr>
+      <w:r>
+        <w:t xml:space="preserve">Get the number of cases in the subsetted data. How many cases did you drop?</w:t>
+      </w:r>
+    </w:p>
     <w:p>
       <w:pPr>
         <w:pStyle w:val="BodyText"/>
@@ -1503,6 +1490,63 @@
         </w:rPr>
         <w:t xml:space="preserve">)])</w:t>
       </w:r>
+      <w:r>
+        <w:br/>
+      </w:r>
+      <w:r>
+        <w:br/>
+      </w:r>
+      <w:r>
+        <w:rPr>
+          <w:rStyle w:val="FunctionTok"/>
+        </w:rPr>
+        <w:t xml:space="preserve">nrow</w:t>
+      </w:r>
+      <w:r>
+        <w:rPr>
+          <w:rStyle w:val="NormalTok"/>
+        </w:rPr>
+        <w:t xml:space="preserve">(sub_ecls)</w:t>
+      </w:r>
+      <w:r>
+        <w:br/>
+      </w:r>
+      <w:r>
+        <w:rPr>
+          <w:rStyle w:val="FunctionTok"/>
+        </w:rPr>
+        <w:t xml:space="preserve">nrow</w:t>
+      </w:r>
+      <w:r>
+        <w:rPr>
+          <w:rStyle w:val="NormalTok"/>
+        </w:rPr>
+        <w:t xml:space="preserve">(ecls) </w:t>
+      </w:r>
+      <w:r>
+        <w:rPr>
+          <w:rStyle w:val="SpecialCharTok"/>
+        </w:rPr>
+        <w:t xml:space="preserve">-</w:t>
+      </w:r>
+      <w:r>
+        <w:rPr>
+          <w:rStyle w:val="NormalTok"/>
+        </w:rPr>
+        <w:t xml:space="preserve"> </w:t>
+      </w:r>
+      <w:r>
+        <w:rPr>
+          <w:rStyle w:val="FunctionTok"/>
+        </w:rPr>
+        <w:t xml:space="preserve">nrow</w:t>
+      </w:r>
+      <w:r>
+        <w:rPr>
+          <w:rStyle w:val="NormalTok"/>
+        </w:rPr>
+        <w:t xml:space="preserve">(sub_ecls)</w:t>
+      </w:r>
     </w:p>
     <w:p>
       <w:pPr>
@@ -1595,118 +1639,29 @@
         <w:t xml:space="preserve">## 6 0001006C -1.11          5</w:t>
       </w:r>
     </w:p>
+    <w:p>
+      <w:pPr>
+        <w:pStyle w:val="SourceCode"/>
+      </w:pPr>
+      <w:r>
+        <w:rPr>
+          <w:rStyle w:val="VerbatimChar"/>
+        </w:rPr>
+        <w:t xml:space="preserve">## [1] 18167</w:t>
+      </w:r>
+    </w:p>
+    <w:p>
+      <w:pPr>
+        <w:pStyle w:val="SourceCode"/>
+      </w:pPr>
+      <w:r>
+        <w:rPr>
+          <w:rStyle w:val="VerbatimChar"/>
+        </w:rPr>
+        <w:t xml:space="preserve">## [1] 3093</w:t>
+      </w:r>
+    </w:p>
     <w:bookmarkEnd w:id="26"/>
-    <w:bookmarkStart w:id="27" w:name="problem-5-1-pt"/>
-    <w:p>
-      <w:pPr>
-        <w:pStyle w:val="Heading2"/>
-      </w:pPr>
-      <w:r>
-        <w:t xml:space="preserve">Problem 5 (1 pt)</w:t>
-      </w:r>
-    </w:p>
-    <w:p>
-      <w:pPr>
-        <w:pStyle w:val="FirstParagraph"/>
-      </w:pPr>
-      <w:r>
-        <w:t xml:space="preserve">Get the number of cases in the subsetted data. How many cases did you drop?</w:t>
-      </w:r>
-    </w:p>
-    <w:p>
-      <w:pPr>
-        <w:pStyle w:val="BodyText"/>
-      </w:pPr>
-      <w:r>
-        <w:t xml:space="preserve">Syntax:</w:t>
-      </w:r>
-    </w:p>
-    <w:p>
-      <w:pPr>
-        <w:pStyle w:val="SourceCode"/>
-      </w:pPr>
-      <w:r>
-        <w:rPr>
-          <w:rStyle w:val="FunctionTok"/>
-        </w:rPr>
-        <w:t xml:space="preserve">nrow</w:t>
-      </w:r>
-      <w:r>
-        <w:rPr>
-          <w:rStyle w:val="NormalTok"/>
-        </w:rPr>
-        <w:t xml:space="preserve">(sub_ecls)</w:t>
-      </w:r>
-      <w:r>
-        <w:br/>
-      </w:r>
-      <w:r>
-        <w:rPr>
-          <w:rStyle w:val="FunctionTok"/>
-        </w:rPr>
-        <w:t xml:space="preserve">nrow</w:t>
-      </w:r>
-      <w:r>
-        <w:rPr>
-          <w:rStyle w:val="NormalTok"/>
-        </w:rPr>
-        <w:t xml:space="preserve">(ecls) </w:t>
-      </w:r>
-      <w:r>
-        <w:rPr>
-          <w:rStyle w:val="SpecialCharTok"/>
-        </w:rPr>
-        <w:t xml:space="preserve">-</w:t>
-      </w:r>
-      <w:r>
-        <w:rPr>
-          <w:rStyle w:val="NormalTok"/>
-        </w:rPr>
-        <w:t xml:space="preserve"> </w:t>
-      </w:r>
-      <w:r>
-        <w:rPr>
-          <w:rStyle w:val="FunctionTok"/>
-        </w:rPr>
-        <w:t xml:space="preserve">nrow</w:t>
-      </w:r>
-      <w:r>
-        <w:rPr>
-          <w:rStyle w:val="NormalTok"/>
-        </w:rPr>
-        <w:t xml:space="preserve">(sub_ecls)</w:t>
-      </w:r>
-    </w:p>
-    <w:p>
-      <w:pPr>
-        <w:pStyle w:val="FirstParagraph"/>
-      </w:pPr>
-      <w:r>
-        <w:t xml:space="preserve">Output:</w:t>
-      </w:r>
-    </w:p>
-    <w:p>
-      <w:pPr>
-        <w:pStyle w:val="SourceCode"/>
-      </w:pPr>
-      <w:r>
-        <w:rPr>
-          <w:rStyle w:val="VerbatimChar"/>
-        </w:rPr>
-        <w:t xml:space="preserve">## [1] 18167</w:t>
-      </w:r>
-    </w:p>
-    <w:p>
-      <w:pPr>
-        <w:pStyle w:val="SourceCode"/>
-      </w:pPr>
-      <w:r>
-        <w:rPr>
-          <w:rStyle w:val="VerbatimChar"/>
-        </w:rPr>
-        <w:t xml:space="preserve">## [1] 3093</w:t>
-      </w:r>
-    </w:p>
     <w:bookmarkEnd w:id="27"/>
     <w:bookmarkStart w:id="34" w:name="problem-6-4-pt"/>
     <w:p>
@@ -2437,7 +2392,7 @@
               <a:graphicData uri="http://schemas.openxmlformats.org/drawingml/2006/picture">
                 <pic:pic>
                   <pic:nvPicPr>
-                    <pic:cNvPr descr="lab_15_final_files/figure-docx/unnamed-chunk-19-1.png" id="30" name="Picture"/>
+                    <pic:cNvPr descr="lab_15_final_files/figure-docx/unnamed-chunk-13-1.png" id="30" name="Picture"/>
                     <pic:cNvPicPr>
                       <a:picLocks noChangeArrowheads="1" noChangeAspect="1"/>
                     </pic:cNvPicPr>
@@ -2484,7 +2439,7 @@
               <a:graphicData uri="http://schemas.openxmlformats.org/drawingml/2006/picture">
                 <pic:pic>
                   <pic:nvPicPr>
-                    <pic:cNvPr descr="lab_15_final_files/figure-docx/unnamed-chunk-20-1.png" id="33" name="Picture"/>
+                    <pic:cNvPr descr="lab_15_final_files/figure-docx/unnamed-chunk-14-1.png" id="33" name="Picture"/>
                     <pic:cNvPicPr>
                       <a:picLocks noChangeArrowheads="1" noChangeAspect="1"/>
                     </pic:cNvPicPr>
@@ -3343,7 +3298,7 @@
               <a:graphicData uri="http://schemas.openxmlformats.org/drawingml/2006/picture">
                 <pic:pic>
                   <pic:nvPicPr>
-                    <pic:cNvPr descr="lab_15_final_files/figure-docx/unnamed-chunk-22-1.png" id="37" name="Picture"/>
+                    <pic:cNvPr descr="lab_15_final_files/figure-docx/unnamed-chunk-16-1.png" id="37" name="Picture"/>
                     <pic:cNvPicPr>
                       <a:picLocks noChangeArrowheads="1" noChangeAspect="1"/>
                     </pic:cNvPicPr>
@@ -7542,7 +7497,7 @@
               <a:graphicData uri="http://schemas.openxmlformats.org/drawingml/2006/picture">
                 <pic:pic>
                   <pic:nvPicPr>
-                    <pic:cNvPr descr="lab_15_final_files/figure-docx/unnamed-chunk-38-1.png" id="50" name="Picture"/>
+                    <pic:cNvPr descr="lab_15_final_files/figure-docx/unnamed-chunk-32-1.png" id="50" name="Picture"/>
                     <pic:cNvPicPr>
                       <a:picLocks noChangeArrowheads="1" noChangeAspect="1"/>
                     </pic:cNvPicPr>
@@ -7835,6 +7790,18 @@
           <w:rStyle w:val="VerbatimChar"/>
         </w:rPr>
         <w:t xml:space="preserve">B = 0.196</w:t>
+      </w:r>
+      <w:r>
+        <w:t xml:space="preserve">,</w:t>
+      </w:r>
+      <w:r>
+        <w:t xml:space="preserve"> </w:t>
+      </w:r>
+      <w:r>
+        <w:rPr>
+          <w:rStyle w:val="VerbatimChar"/>
+        </w:rPr>
+        <w:t xml:space="preserve">SE = 0.006</w:t>
       </w:r>
       <w:r>
         <w:t xml:space="preserve">,</w:t>

</xml_diff>